<commit_message>
PAUSED (task177): stage 4 round 3 fix, waiting on the re-judge
Round 3 (target.zip 8ab100af): readers E and F missed the call (13, 11) and kept 0 of 24 ask figures; the judge
NOT_DETERMINISTIC on the whole per cent (its reproductions ran 25.8 to 27.9 under open conventions). The share is
now asked to the nearest 5 per cent (golden 26.05 prints 25, 1.45 points inside its cell); plan 5.1 files the
denominator and the start channel, plan 4.1 the check-in's due date; the learner, its rates and the transfers'
weighting stay unfiled. Every judge reading under the filed conventions prints 25 or is ruled out (J3 in checks).
Moved: the call 26 to 25 (and two workbook-only model forecasts). Checks 130 of 130, verify 26 of 26,
byte-identical rebuild, figures_check and precut exit 0; heart BLOCK ruled by the author (window fixed at draw).

Co-Authored-By: Claude Opus 5.5 <noreply@anthropic.com>
Claude-Session: https://claude.ai/code/session_01A6XcFx5t62c7gPi1bBKcVi
</commit_message>
<xml_diff>
--- a/task177/golden/assistant_first_aftermath_note.docx
+++ b/task177/golden/assistant_first_aftermath_note.docx
@@ -7,7 +7,7 @@
         <w:pStyle w:val="Heading1"/>
       </w:pPr>
       <w:r>
-        <w:t>Jobseekers will start 26 per cent of their own contacts in Ask Prairie Works in March and April</w:t>
+        <w:t>Jobseekers will start 25 per cent of their own contacts in Ask Prairie Works in March and April</w:t>
       </w:r>
     </w:p>
     <w:p>
@@ -26,7 +26,7 @@
         <w:rPr>
           <w:b/>
         </w:rPr>
-        <w:t>Jobseekers on the register on 3 January 2027 will start 26 per cent of the contacts they make themselves between 1 March and 25 April 2027 in Ask Prairie Works.</w:t>
+        <w:t>Jobseekers on the register on 3 January 2027 will start 25 per cent of the contacts they make themselves between 1 March and 25 April 2027 in Ask Prairie Works.</w:t>
       </w:r>
     </w:p>
     <w:p>
@@ -122,7 +122,7 @@
           </w:tcPr>
           <w:p>
             <w:r>
-              <w:t>26%</w:t>
+              <w:t>25%</w:t>
             </w:r>
           </w:p>
         </w:tc>

</xml_diff>